<commit_message>
forgot to add orcid number
</commit_message>
<xml_diff>
--- a/Docx versions/CardiovascularRenal_v1_3.docx
+++ b/Docx versions/CardiovascularRenal_v1_3.docx
@@ -45,7 +45,7 @@
         <w:t xml:space="preserve">M. Finnegan</w:t>
       </w:r>
       <w:r>
-        <w:t xml:space="preserve">  ·  v1.3 — March 2026  ·  </w:t>
+        <w:t xml:space="preserve">  ·  ORCID: 0009-0009-4921-7722  ·  v1.3 — March 2026  ·  </w:t>
       </w:r>
       <w:r>
         <w:rPr>
@@ -5437,7 +5437,7 @@
       <w:jc w:val="center"/>
     </w:pPr>
     <w:r>
-      <w:t xml:space="preserve">The Cardiovascular and Renal Systems — v1.3 — March 2026 — Unpublished draft, not yet peer reviewed   |   Page </w:t>
+      <w:t xml:space="preserve">The Cardiovascular and Renal Systems — v1.3 — March 2026 — M. Finnegan ORCID 0009-0009-4921-7722   |   Page </w:t>
     </w:r>
     <w:r>
       <w:fldChar w:fldCharType="begin"/>

</xml_diff>